<commit_message>
State the Phase 2 plan instead of asking the committee to choose
Slide 9 previously closed by inviting the committee to pick which direction to
prioritise. That reads as not having decided. It now presents the same three
items as a numbered plan in priority order and closes with a statement:
Phase 2 begins with the nonlinearity experiment, because the Phase 1 robustness
result already fixes its design.

Same change in the report's Future Work section, and in the slide 9 speaker
note, which now says explicitly not to ask them to choose. If the committee
wants to redirect the work they will say so, and that is what FEEDBACK.md is for.

Co-Authored-By: Claude Opus 5 (1M context) <noreply@anthropic.com>
</commit_message>
<xml_diff>
--- a/Mid_Sem_Report_TEMPLATE.docx
+++ b/Mid_Sem_Report_TEMPLATE.docx
@@ -6963,7 +6963,7 @@
           <w:sz w:val="24"/>
           <w:szCs w:val="24"/>
         </w:rPr>
-        <w:t xml:space="preserve">Phase 1 has answered the question the project set out to answer. The directions below are candidates for the remainder of the work rather than commitments; guidance from the committee on which to prioritise would be welcome.</w:t>
+        <w:t xml:space="preserve">Phase 1 has answered the question the project set out to answer. The work below is planned for the remainder of the project, in the order given. It begins with fibre nonlinearity, where the Phase 1 robustness result already fixes the experimental design.</w:t>
       </w:r>
     </w:p>
     <w:p>
@@ -6997,17 +6997,17 @@
           <w:szCs w:val="19"/>
         </w:rPr>
         <w:br/>
-        <w:t xml:space="preserve">Frame these as candidate directions, not commitments, so the committee feedback can shape</w:t>
-      </w:r>
-      <w:r>
-        <w:rPr>
-          <w:rFonts w:ascii="Calibri" w:cs="Calibri" w:eastAsia="Calibri" w:hAnsi="Calibri"/>
-          <w:color w:val="5B3A16"/>
-          <w:sz w:val="19"/>
-          <w:szCs w:val="19"/>
-        </w:rPr>
-        <w:br/>
-        <w:t xml:space="preserve">which ones are taken up. Two or three sentences is enough.</w:t>
+        <w:t xml:space="preserve">Frame these as a plan in priority order, not a menu. State what you will do and why that</w:t>
+      </w:r>
+      <w:r>
+        <w:rPr>
+          <w:rFonts w:ascii="Calibri" w:cs="Calibri" w:eastAsia="Calibri" w:hAnsi="Calibri"/>
+          <w:color w:val="5B3A16"/>
+          <w:sz w:val="19"/>
+          <w:szCs w:val="19"/>
+        </w:rPr>
+        <w:br/>
+        <w:t xml:space="preserve">order, rather than what might be done. Two or three sentences is enough.</w:t>
       </w:r>
     </w:p>
     <w:p>

</xml_diff>